<commit_message>
Restrict FM Mock 02 to the ten study text chapters
Replace the four financial-environment questions (economic policy,
Treasury bill yield, yield curve, financial intermediaries) with
questions on asset investment decisions (EAC, lease or buy, capital
rationing) and Chapter 1 performance measures (earnings yield, dividend
cover, P/E, financial risk indicators), at the same difficulty and in
the same formats. Relabel the answer summary with the chapter numbering
supplied for the course.

Co-Authored-By: Claude Opus 5.5 <noreply@anthropic.com>
Claude-Session: https://claude.ai/code/session_01Uvnmzg2pJDshYudjR7iNRh
</commit_message>
<xml_diff>
--- a/mock-exams/FM_Mock_Exam_02_Answers.docx
+++ b/mock-exams/FM_Mock_Exam_02_Answers.docx
@@ -409,7 +409,7 @@
               <w:rPr>
                 <w:sz w:val="17"/>
               </w:rPr>
-              <w:t>True, False, True</w:t>
+              <w:t>True, False, False</w:t>
             </w:r>
           </w:p>
         </w:tc>
@@ -461,7 +461,7 @@
               <w:rPr>
                 <w:sz w:val="17"/>
               </w:rPr>
-              <w:t>2 FM environment</w:t>
+              <w:t>5 Asset investment decisions</w:t>
             </w:r>
           </w:p>
         </w:tc>
@@ -501,7 +501,7 @@
               <w:rPr>
                 <w:sz w:val="17"/>
               </w:rPr>
-              <w:t>6.68%</w:t>
+              <w:t>$41,675</w:t>
             </w:r>
           </w:p>
         </w:tc>
@@ -553,7 +553,7 @@
               <w:rPr>
                 <w:sz w:val="17"/>
               </w:rPr>
-              <w:t>2 FM environment</w:t>
+              <w:t>5 Asset investment decisions</w:t>
             </w:r>
           </w:p>
         </w:tc>
@@ -737,7 +737,7 @@
               <w:rPr>
                 <w:sz w:val="17"/>
               </w:rPr>
-              <w:t>3 Working capital</w:t>
+              <w:t>7 Working capital management</w:t>
             </w:r>
           </w:p>
         </w:tc>
@@ -829,7 +829,7 @@
               <w:rPr>
                 <w:sz w:val="17"/>
               </w:rPr>
-              <w:t>4 Managing WC</w:t>
+              <w:t>8 Inventory control</w:t>
             </w:r>
           </w:p>
         </w:tc>
@@ -921,7 +921,7 @@
               <w:rPr>
                 <w:sz w:val="17"/>
               </w:rPr>
-              <w:t>4 Managing WC</w:t>
+              <w:t>9 Receivables and payables</w:t>
             </w:r>
           </w:p>
         </w:tc>
@@ -1013,7 +1013,7 @@
               <w:rPr>
                 <w:sz w:val="17"/>
               </w:rPr>
-              <w:t>5 WC finance</w:t>
+              <w:t>10 Cash and funding</w:t>
             </w:r>
           </w:p>
         </w:tc>
@@ -1105,7 +1105,7 @@
               <w:rPr>
                 <w:sz w:val="17"/>
               </w:rPr>
-              <w:t>6 Investment decisions</w:t>
+              <w:t>2 Basic investment appraisal</w:t>
             </w:r>
           </w:p>
         </w:tc>
@@ -1197,7 +1197,7 @@
               <w:rPr>
                 <w:sz w:val="17"/>
               </w:rPr>
-              <w:t>7 DCF</w:t>
+              <w:t>3 DCF techniques</w:t>
             </w:r>
           </w:p>
         </w:tc>
@@ -1289,7 +1289,7 @@
               <w:rPr>
                 <w:sz w:val="17"/>
               </w:rPr>
-              <w:t>7 DCF</w:t>
+              <w:t>3 DCF techniques</w:t>
             </w:r>
           </w:p>
         </w:tc>
@@ -1381,7 +1381,7 @@
               <w:rPr>
                 <w:sz w:val="17"/>
               </w:rPr>
-              <w:t>8 Tax and inflation</w:t>
+              <w:t>4 Further aspects of DCF</w:t>
             </w:r>
           </w:p>
         </w:tc>
@@ -1473,7 +1473,7 @@
               <w:rPr>
                 <w:sz w:val="17"/>
               </w:rPr>
-              <w:t>8 Tax and inflation</w:t>
+              <w:t>4 Further aspects of DCF</w:t>
             </w:r>
           </w:p>
         </w:tc>
@@ -1565,7 +1565,7 @@
               <w:rPr>
                 <w:sz w:val="17"/>
               </w:rPr>
-              <w:t>9 Risk</w:t>
+              <w:t>6 Uncertainty</w:t>
             </w:r>
           </w:p>
         </w:tc>
@@ -1657,7 +1657,7 @@
               <w:rPr>
                 <w:sz w:val="17"/>
               </w:rPr>
-              <w:t>10 Specific decisions</w:t>
+              <w:t>5 Asset investment decisions</w:t>
             </w:r>
           </w:p>
         </w:tc>
@@ -1749,7 +1749,7 @@
               <w:rPr>
                 <w:sz w:val="17"/>
               </w:rPr>
-              <w:t>4 Managing WC</w:t>
+              <w:t>9 Receivables and payables</w:t>
             </w:r>
           </w:p>
         </w:tc>
@@ -1841,7 +1841,7 @@
               <w:rPr>
                 <w:sz w:val="17"/>
               </w:rPr>
-              <w:t>4 Managing WC</w:t>
+              <w:t>9 Receivables and payables</w:t>
             </w:r>
           </w:p>
         </w:tc>
@@ -1933,7 +1933,7 @@
               <w:rPr>
                 <w:sz w:val="17"/>
               </w:rPr>
-              <w:t>3 Working capital</w:t>
+              <w:t>7 Working capital management</w:t>
             </w:r>
           </w:p>
         </w:tc>
@@ -2025,7 +2025,7 @@
               <w:rPr>
                 <w:sz w:val="17"/>
               </w:rPr>
-              <w:t>3 Working capital</w:t>
+              <w:t>7 Working capital management</w:t>
             </w:r>
           </w:p>
         </w:tc>
@@ -2117,7 +2117,7 @@
               <w:rPr>
                 <w:sz w:val="17"/>
               </w:rPr>
-              <w:t>4 Managing WC</w:t>
+              <w:t>9 Receivables and payables</w:t>
             </w:r>
           </w:p>
         </w:tc>
@@ -2209,7 +2209,7 @@
               <w:rPr>
                 <w:sz w:val="17"/>
               </w:rPr>
-              <w:t>8 Tax and inflation</w:t>
+              <w:t>4 Further aspects of DCF</w:t>
             </w:r>
           </w:p>
         </w:tc>
@@ -2301,7 +2301,7 @@
               <w:rPr>
                 <w:sz w:val="17"/>
               </w:rPr>
-              <w:t>8 Tax and inflation</w:t>
+              <w:t>4 Further aspects of DCF</w:t>
             </w:r>
           </w:p>
         </w:tc>
@@ -2393,7 +2393,7 @@
               <w:rPr>
                 <w:sz w:val="17"/>
               </w:rPr>
-              <w:t>8 Tax and inflation</w:t>
+              <w:t>4 Further aspects of DCF</w:t>
             </w:r>
           </w:p>
         </w:tc>
@@ -2485,7 +2485,7 @@
               <w:rPr>
                 <w:sz w:val="17"/>
               </w:rPr>
-              <w:t>8 Tax and inflation</w:t>
+              <w:t>4 Further aspects of DCF</w:t>
             </w:r>
           </w:p>
         </w:tc>
@@ -2577,7 +2577,7 @@
               <w:rPr>
                 <w:sz w:val="17"/>
               </w:rPr>
-              <w:t>8 Tax and inflation</w:t>
+              <w:t>4 Further aspects of DCF</w:t>
             </w:r>
           </w:p>
         </w:tc>
@@ -2853,7 +2853,7 @@
               <w:rPr>
                 <w:sz w:val="17"/>
               </w:rPr>
-              <w:t>2 FM environment</w:t>
+              <w:t>1 FM function</w:t>
             </w:r>
           </w:p>
         </w:tc>
@@ -2945,7 +2945,7 @@
               <w:rPr>
                 <w:sz w:val="17"/>
               </w:rPr>
-              <w:t>2 FM environment</w:t>
+              <w:t>1 FM function</w:t>
             </w:r>
           </w:p>
         </w:tc>
@@ -3131,7 +3131,7 @@
         <w:rPr>
           <w:color w:val="000000"/>
         </w:rPr>
-        <w:t>Question 2: True, False, True</w:t>
+        <w:t>Question 2: True, False, False</w:t>
       </w:r>
     </w:p>
     <w:p>
@@ -3147,7 +3147,7 @@
       </w:r>
       <w:r>
         <w:rPr/>
-        <w:t xml:space="preserve"> Higher interest rates attract inflows of foreign capital, which increases demand for the currency.</w:t>
+        <w:t xml:space="preserve"> The equivalent annual cost method compares replacement cycles of different lengths by assuming each cycle repeats indefinitely with an identical asset, ignoring inflation and technological change.</w:t>
       </w:r>
     </w:p>
     <w:p>
@@ -3163,7 +3163,7 @@
       </w:r>
       <w:r>
         <w:rPr/>
-        <w:t xml:space="preserve"> This is the trap. Expansionary fiscal policy *reduces* taxation and/or increases government spending to *raise* aggregate demand. Increasing taxation is contractionary.</w:t>
+        <w:t xml:space="preserve"> This is the trap. A lease or buy decision is a financing decision, so the cash flows are discounted at the (after-tax) cost of borrowing, not the WACC.</w:t>
       </w:r>
     </w:p>
     <w:p>
@@ -3175,77 +3175,554 @@
         <w:rPr>
           <w:b/>
         </w:rPr>
-        <w:t>True.</w:t>
+        <w:t>False.</w:t>
       </w:r>
       <w:r>
         <w:rPr/>
-        <w:t xml:space="preserve"> This is the definition of monetary policy.</w:t>
-      </w:r>
-    </w:p>
-    <w:p>
-      <w:pPr>
-        <w:pBdr>
-          <w:bottom w:val="single" w:sz="8" w:space="1" w:color="000000"/>
-        </w:pBdr>
-        <w:spacing w:before="0" w:after="160"/>
-      </w:pPr>
-    </w:p>
-    <w:p>
-      <w:pPr>
-        <w:pStyle w:val="Heading3"/>
-        <w:pageBreakBefore w:val="0"/>
-      </w:pPr>
-      <w:r>
-        <w:rPr>
-          <w:color w:val="000000"/>
-        </w:rPr>
-        <w:t>Question 3: 6.68%</w:t>
-      </w:r>
-    </w:p>
-    <w:p>
-      <w:pPr>
-        <w:keepNext w:val="0"/>
-        <w:spacing w:after="80" w:before="0"/>
-      </w:pPr>
-      <w:r>
-        <w:rPr/>
-        <w:t>Return for 91 days = (100 − 98.40) / 98.40 = 1.626%</w:t>
-      </w:r>
-    </w:p>
-    <w:p>
-      <w:pPr>
-        <w:keepNext w:val="0"/>
-        <w:spacing w:after="80" w:before="0"/>
-      </w:pPr>
-      <w:r>
-        <w:rPr/>
-        <w:t xml:space="preserve">Effective annual yield = (100 / 98.40)^(365/91) − 1 = </w:t>
+        <w:t xml:space="preserve"> Limits set by the company's own management are </w:t>
       </w:r>
       <w:r>
         <w:rPr>
           <w:b/>
         </w:rPr>
-        <w:t>6.68%</w:t>
+        <w:t>soft</w:t>
+      </w:r>
+      <w:r>
+        <w:rPr/>
+        <w:t xml:space="preserve"> capital rationing. Hard capital rationing is imposed from outside the company, for example when lenders will not provide more finance.</w:t>
       </w:r>
     </w:p>
     <w:p>
       <w:pPr>
+        <w:pBdr>
+          <w:bottom w:val="single" w:sz="8" w:space="1" w:color="000000"/>
+        </w:pBdr>
+        <w:spacing w:before="0" w:after="160"/>
+      </w:pPr>
+    </w:p>
+    <w:p>
+      <w:pPr>
+        <w:pStyle w:val="Heading3"/>
+        <w:pageBreakBefore w:val="0"/>
+      </w:pPr>
+      <w:r>
+        <w:rPr>
+          <w:color w:val="000000"/>
+        </w:rPr>
+        <w:t>Question 3: $41,675</w:t>
+      </w:r>
+    </w:p>
+    <w:tbl>
+      <w:tblPr>
+        <w:tblStyle w:val="TableGrid"/>
+        <w:tblW w:type="auto" w:w="0"/>
+        <w:jc w:val="center"/>
+        <w:tblLayout w:type="fixed"/>
+        <w:tblLook w:firstColumn="1" w:firstRow="1" w:lastColumn="0" w:lastRow="0" w:noHBand="0" w:noVBand="1" w:val="04A0"/>
+      </w:tblPr>
+      <w:tblGrid>
+        <w:gridCol w:w="4329"/>
+        <w:gridCol w:w="1694"/>
+        <w:gridCol w:w="1694"/>
+        <w:gridCol w:w="1694"/>
+      </w:tblGrid>
+      <w:tr>
+        <w:trPr>
+          <w:cantSplit/>
+          <w:tblHeader/>
+        </w:trPr>
+        <w:tc>
+          <w:tcPr>
+            <w:tcW w:type="dxa" w:w="4329"/>
+          </w:tcPr>
+          <w:p>
+            <w:pPr>
+              <w:spacing w:after="0"/>
+            </w:pPr>
+            <w:r>
+              <w:rPr>
+                <w:b/>
+              </w:rPr>
+            </w:r>
+            <w:r>
+              <w:rPr>
+                <w:b/>
+                <w:sz w:val="18"/>
+              </w:rPr>
+              <w:t>Year</w:t>
+            </w:r>
+          </w:p>
+        </w:tc>
+        <w:tc>
+          <w:tcPr>
+            <w:tcW w:type="dxa" w:w="1694"/>
+          </w:tcPr>
+          <w:p>
+            <w:pPr>
+              <w:spacing w:after="0"/>
+              <w:jc w:val="center"/>
+            </w:pPr>
+            <w:r>
+              <w:rPr>
+                <w:b/>
+              </w:rPr>
+            </w:r>
+            <w:r>
+              <w:rPr>
+                <w:b/>
+                <w:sz w:val="18"/>
+              </w:rPr>
+              <w:t>Cash flow ($)</w:t>
+            </w:r>
+          </w:p>
+        </w:tc>
+        <w:tc>
+          <w:tcPr>
+            <w:tcW w:type="dxa" w:w="1694"/>
+          </w:tcPr>
+          <w:p>
+            <w:pPr>
+              <w:spacing w:after="0"/>
+              <w:jc w:val="center"/>
+            </w:pPr>
+            <w:r>
+              <w:rPr>
+                <w:b/>
+              </w:rPr>
+            </w:r>
+            <w:r>
+              <w:rPr>
+                <w:b/>
+                <w:sz w:val="18"/>
+              </w:rPr>
+              <w:t>Discount factor at 12%</w:t>
+            </w:r>
+          </w:p>
+        </w:tc>
+        <w:tc>
+          <w:tcPr>
+            <w:tcW w:type="dxa" w:w="1694"/>
+          </w:tcPr>
+          <w:p>
+            <w:pPr>
+              <w:spacing w:after="0"/>
+              <w:jc w:val="center"/>
+            </w:pPr>
+            <w:r>
+              <w:rPr>
+                <w:b/>
+              </w:rPr>
+            </w:r>
+            <w:r>
+              <w:rPr>
+                <w:b/>
+                <w:sz w:val="18"/>
+              </w:rPr>
+              <w:t>Present value ($)</w:t>
+            </w:r>
+          </w:p>
+        </w:tc>
+      </w:tr>
+      <w:tr>
+        <w:trPr>
+          <w:cantSplit/>
+        </w:trPr>
+        <w:tc>
+          <w:tcPr>
+            <w:tcW w:type="dxa" w:w="4329"/>
+          </w:tcPr>
+          <w:p>
+            <w:pPr>
+              <w:spacing w:after="0"/>
+            </w:pPr>
+            <w:r/>
+            <w:r>
+              <w:rPr>
+                <w:sz w:val="18"/>
+              </w:rPr>
+              <w:t>0</w:t>
+            </w:r>
+          </w:p>
+        </w:tc>
+        <w:tc>
+          <w:tcPr>
+            <w:tcW w:type="dxa" w:w="1694"/>
+          </w:tcPr>
+          <w:p>
+            <w:pPr>
+              <w:spacing w:after="0"/>
+              <w:jc w:val="center"/>
+            </w:pPr>
+            <w:r/>
+            <w:r>
+              <w:rPr>
+                <w:sz w:val="18"/>
+              </w:rPr>
+              <w:t>(85,000)</w:t>
+            </w:r>
+          </w:p>
+        </w:tc>
+        <w:tc>
+          <w:tcPr>
+            <w:tcW w:type="dxa" w:w="1694"/>
+          </w:tcPr>
+          <w:p>
+            <w:pPr>
+              <w:spacing w:after="0"/>
+              <w:jc w:val="center"/>
+            </w:pPr>
+            <w:r/>
+            <w:r>
+              <w:rPr>
+                <w:sz w:val="18"/>
+              </w:rPr>
+              <w:t>1.000</w:t>
+            </w:r>
+          </w:p>
+        </w:tc>
+        <w:tc>
+          <w:tcPr>
+            <w:tcW w:type="dxa" w:w="1694"/>
+          </w:tcPr>
+          <w:p>
+            <w:pPr>
+              <w:spacing w:after="0"/>
+              <w:jc w:val="center"/>
+            </w:pPr>
+            <w:r/>
+            <w:r>
+              <w:rPr>
+                <w:sz w:val="18"/>
+              </w:rPr>
+              <w:t>(85,000)</w:t>
+            </w:r>
+          </w:p>
+        </w:tc>
+      </w:tr>
+      <w:tr>
+        <w:trPr>
+          <w:cantSplit/>
+        </w:trPr>
+        <w:tc>
+          <w:tcPr>
+            <w:tcW w:type="dxa" w:w="4329"/>
+          </w:tcPr>
+          <w:p>
+            <w:pPr>
+              <w:spacing w:after="0"/>
+            </w:pPr>
+            <w:r/>
+            <w:r>
+              <w:rPr>
+                <w:sz w:val="18"/>
+              </w:rPr>
+              <w:t>1</w:t>
+            </w:r>
+          </w:p>
+        </w:tc>
+        <w:tc>
+          <w:tcPr>
+            <w:tcW w:type="dxa" w:w="1694"/>
+          </w:tcPr>
+          <w:p>
+            <w:pPr>
+              <w:spacing w:after="0"/>
+              <w:jc w:val="center"/>
+            </w:pPr>
+            <w:r/>
+            <w:r>
+              <w:rPr>
+                <w:sz w:val="18"/>
+              </w:rPr>
+              <w:t>(10,000)</w:t>
+            </w:r>
+          </w:p>
+        </w:tc>
+        <w:tc>
+          <w:tcPr>
+            <w:tcW w:type="dxa" w:w="1694"/>
+          </w:tcPr>
+          <w:p>
+            <w:pPr>
+              <w:spacing w:after="0"/>
+              <w:jc w:val="center"/>
+            </w:pPr>
+            <w:r/>
+            <w:r>
+              <w:rPr>
+                <w:sz w:val="18"/>
+              </w:rPr>
+              <w:t>0.893</w:t>
+            </w:r>
+          </w:p>
+        </w:tc>
+        <w:tc>
+          <w:tcPr>
+            <w:tcW w:type="dxa" w:w="1694"/>
+          </w:tcPr>
+          <w:p>
+            <w:pPr>
+              <w:spacing w:after="0"/>
+              <w:jc w:val="center"/>
+            </w:pPr>
+            <w:r/>
+            <w:r>
+              <w:rPr>
+                <w:sz w:val="18"/>
+              </w:rPr>
+              <w:t>(8,930)</w:t>
+            </w:r>
+          </w:p>
+        </w:tc>
+      </w:tr>
+      <w:tr>
+        <w:trPr>
+          <w:cantSplit/>
+        </w:trPr>
+        <w:tc>
+          <w:tcPr>
+            <w:tcW w:type="dxa" w:w="4329"/>
+          </w:tcPr>
+          <w:p>
+            <w:pPr>
+              <w:spacing w:after="0"/>
+            </w:pPr>
+            <w:r/>
+            <w:r>
+              <w:rPr>
+                <w:sz w:val="18"/>
+              </w:rPr>
+              <w:t>2</w:t>
+            </w:r>
+          </w:p>
+        </w:tc>
+        <w:tc>
+          <w:tcPr>
+            <w:tcW w:type="dxa" w:w="1694"/>
+          </w:tcPr>
+          <w:p>
+            <w:pPr>
+              <w:spacing w:after="0"/>
+              <w:jc w:val="center"/>
+            </w:pPr>
+            <w:r/>
+            <w:r>
+              <w:rPr>
+                <w:sz w:val="18"/>
+              </w:rPr>
+              <w:t>(14,000)</w:t>
+            </w:r>
+          </w:p>
+        </w:tc>
+        <w:tc>
+          <w:tcPr>
+            <w:tcW w:type="dxa" w:w="1694"/>
+          </w:tcPr>
+          <w:p>
+            <w:pPr>
+              <w:spacing w:after="0"/>
+              <w:jc w:val="center"/>
+            </w:pPr>
+            <w:r/>
+            <w:r>
+              <w:rPr>
+                <w:sz w:val="18"/>
+              </w:rPr>
+              <w:t>0.797</w:t>
+            </w:r>
+          </w:p>
+        </w:tc>
+        <w:tc>
+          <w:tcPr>
+            <w:tcW w:type="dxa" w:w="1694"/>
+          </w:tcPr>
+          <w:p>
+            <w:pPr>
+              <w:spacing w:after="0"/>
+              <w:jc w:val="center"/>
+            </w:pPr>
+            <w:r/>
+            <w:r>
+              <w:rPr>
+                <w:sz w:val="18"/>
+              </w:rPr>
+              <w:t>(11,158)</w:t>
+            </w:r>
+          </w:p>
+        </w:tc>
+      </w:tr>
+      <w:tr>
+        <w:trPr>
+          <w:cantSplit/>
+        </w:trPr>
+        <w:tc>
+          <w:tcPr>
+            <w:tcW w:type="dxa" w:w="4329"/>
+          </w:tcPr>
+          <w:p>
+            <w:pPr>
+              <w:spacing w:after="0"/>
+            </w:pPr>
+            <w:r/>
+            <w:r>
+              <w:rPr>
+                <w:sz w:val="18"/>
+              </w:rPr>
+              <w:t>3</w:t>
+            </w:r>
+          </w:p>
+        </w:tc>
+        <w:tc>
+          <w:tcPr>
+            <w:tcW w:type="dxa" w:w="1694"/>
+          </w:tcPr>
+          <w:p>
+            <w:pPr>
+              <w:spacing w:after="0"/>
+              <w:jc w:val="center"/>
+            </w:pPr>
+            <w:r/>
+            <w:r>
+              <w:rPr>
+                <w:sz w:val="18"/>
+              </w:rPr>
+              <w:t>(18,000) + 25,000 = 7,000</w:t>
+            </w:r>
+          </w:p>
+        </w:tc>
+        <w:tc>
+          <w:tcPr>
+            <w:tcW w:type="dxa" w:w="1694"/>
+          </w:tcPr>
+          <w:p>
+            <w:pPr>
+              <w:spacing w:after="0"/>
+              <w:jc w:val="center"/>
+            </w:pPr>
+            <w:r/>
+            <w:r>
+              <w:rPr>
+                <w:sz w:val="18"/>
+              </w:rPr>
+              <w:t>0.712</w:t>
+            </w:r>
+          </w:p>
+        </w:tc>
+        <w:tc>
+          <w:tcPr>
+            <w:tcW w:type="dxa" w:w="1694"/>
+          </w:tcPr>
+          <w:p>
+            <w:pPr>
+              <w:spacing w:after="0"/>
+              <w:jc w:val="center"/>
+            </w:pPr>
+            <w:r/>
+            <w:r>
+              <w:rPr>
+                <w:sz w:val="18"/>
+              </w:rPr>
+              <w:t>4,984</w:t>
+            </w:r>
+          </w:p>
+        </w:tc>
+      </w:tr>
+      <w:tr>
+        <w:trPr>
+          <w:cantSplit/>
+        </w:trPr>
+        <w:tc>
+          <w:tcPr>
+            <w:tcW w:type="dxa" w:w="4329"/>
+          </w:tcPr>
+          <w:p>
+            <w:pPr>
+              <w:spacing w:after="0"/>
+            </w:pPr>
+            <w:r/>
+            <w:r>
+              <w:rPr>
+                <w:b/>
+                <w:sz w:val="18"/>
+              </w:rPr>
+              <w:t>PV of costs</w:t>
+            </w:r>
+          </w:p>
+        </w:tc>
+        <w:tc>
+          <w:tcPr>
+            <w:tcW w:type="dxa" w:w="1694"/>
+          </w:tcPr>
+          <w:p>
+            <w:pPr>
+              <w:spacing w:after="0"/>
+              <w:jc w:val="center"/>
+            </w:pPr>
+            <w:r/>
+          </w:p>
+        </w:tc>
+        <w:tc>
+          <w:tcPr>
+            <w:tcW w:type="dxa" w:w="1694"/>
+          </w:tcPr>
+          <w:p>
+            <w:pPr>
+              <w:spacing w:after="0"/>
+              <w:jc w:val="center"/>
+            </w:pPr>
+            <w:r/>
+          </w:p>
+        </w:tc>
+        <w:tc>
+          <w:tcPr>
+            <w:tcW w:type="dxa" w:w="1694"/>
+          </w:tcPr>
+          <w:p>
+            <w:pPr>
+              <w:spacing w:after="0"/>
+              <w:jc w:val="center"/>
+            </w:pPr>
+            <w:r/>
+            <w:r>
+              <w:rPr>
+                <w:b/>
+                <w:sz w:val="18"/>
+              </w:rPr>
+              <w:t>(100,104)</w:t>
+            </w:r>
+          </w:p>
+        </w:tc>
+      </w:tr>
+    </w:tbl>
+    <w:p>
+      <w:pPr>
+        <w:spacing w:after="160"/>
+      </w:pPr>
+    </w:p>
+    <w:p>
+      <w:pPr>
         <w:keepNext w:val="0"/>
         <w:spacing w:after="80" w:before="0"/>
       </w:pPr>
       <w:r>
         <w:rPr/>
-        <w:t>Distractors:</w:t>
+        <w:t xml:space="preserve">Equivalent annual cost = 100,104 / annuity factor (12%, 3 years) 2.402 = </w:t>
+      </w:r>
+      <w:r>
+        <w:rPr>
+          <w:b/>
+        </w:rPr>
+        <w:t>$41,675</w:t>
       </w:r>
     </w:p>
     <w:p>
       <w:pPr>
-        <w:pStyle w:val="ListBullet"/>
-        <w:spacing w:after="40"/>
+        <w:keepNext w:val="0"/>
+        <w:spacing w:after="80" w:before="0"/>
       </w:pPr>
       <w:r>
         <w:rPr/>
-        <w:t>6.52%: simple annualisation, 1.626% × 365/91, which ignores compounding.</w:t>
+        <w:t>Traps:</w:t>
       </w:r>
     </w:p>
     <w:p>
@@ -3255,7 +3732,27 @@
       </w:pPr>
       <w:r>
         <w:rPr/>
-        <w:t>6.42%: discount yield, (1.60 / 100) × 365/91, which uses the nominal value instead of the price paid.</w:t>
+        <w:t>Forgetting the trade-in value gives $49,086.</w:t>
+      </w:r>
+    </w:p>
+    <w:p>
+      <w:pPr>
+        <w:pStyle w:val="ListBullet"/>
+        <w:spacing w:after="40"/>
+      </w:pPr>
+      <w:r>
+        <w:rPr/>
+        <w:t>Deducting the trade-in without discounting it gives $38,678.</w:t>
+      </w:r>
+    </w:p>
+    <w:p>
+      <w:pPr>
+        <w:pStyle w:val="ListBullet"/>
+        <w:spacing w:after="40"/>
+      </w:pPr>
+      <w:r>
+        <w:rPr/>
+        <w:t>Dividing the PV by 3 years instead of by the annuity factor gives $33,368. Dividing by the number of years ignores the time value of money.</w:t>
       </w:r>
     </w:p>
     <w:p>
@@ -6004,6 +6501,16 @@
     </w:p>
     <w:p>
       <w:pPr>
+        <w:keepNext w:val="0"/>
+        <w:spacing w:after="80" w:before="0"/>
+      </w:pPr>
+      <w:r>
+        <w:rPr/>
+        <w:t>Earnings attributable to ordinary shareholders = 9.6 − 0.6 = $9.0m, so EPS = 9.0 / 30 = 30.0 cents.</w:t>
+      </w:r>
+    </w:p>
+    <w:p>
+      <w:pPr>
         <w:pStyle w:val="ListBullet"/>
         <w:spacing w:after="40"/>
       </w:pPr>
@@ -6015,7 +6522,7 @@
       </w:r>
       <w:r>
         <w:rPr/>
-        <w:t xml:space="preserve"> Investors want extra return for tying up funds for longer, so long-term yields are higher.</w:t>
+        <w:t xml:space="preserve"> Earnings yield = EPS / share price = 0.30 / 4.50 = 6.7%. It is the reciprocal of the P/E ratio.</w:t>
       </w:r>
     </w:p>
     <w:p>
@@ -6031,17 +6538,7 @@
       </w:r>
       <w:r>
         <w:rPr/>
-        <w:t xml:space="preserve"> An inverted curve (long-term yields below short-term yields) suggests rates are expected to </w:t>
-      </w:r>
-      <w:r>
-        <w:rPr>
-          <w:b/>
-        </w:rPr>
-        <w:t>fall</w:t>
-      </w:r>
-      <w:r>
-        <w:rPr/>
-        <w:t>.</w:t>
+        <w:t xml:space="preserve"> Dividend cover = earnings attributable to ordinary shareholders / ordinary dividends = 9.0 / 5.4 = 1.67 times. The figure of 1.78 times (9.6 / 5.4) is the trap: it forgets to deduct the preference dividends first.</w:t>
       </w:r>
     </w:p>
     <w:p>
@@ -6057,7 +6554,7 @@
       </w:r>
       <w:r>
         <w:rPr/>
-        <w:t xml:space="preserve"> Under market segmentation theory, different investor groups (for example banks at the short end, pension funds at the long end) set each end of the curve.</w:t>
+        <w:t xml:space="preserve"> Current P/E = 4.50 / 0.30 = 15.0 times, above the sector average of 14 times.</w:t>
       </w:r>
     </w:p>
     <w:p>
@@ -6087,7 +6584,7 @@
       </w:pPr>
       <w:r>
         <w:rPr/>
-        <w:t>Financial intermediaries also aggregate small deposits into larger loans.</w:t>
+        <w:t>Financial risk is the risk to shareholders from the use of debt finance: the variability of returns caused by fixed interest commitments.</w:t>
       </w:r>
     </w:p>
     <w:p>
@@ -6099,11 +6596,11 @@
         <w:rPr>
           <w:b/>
         </w:rPr>
-        <w:t>Guaranteeing borrowers a return: wrong.</w:t>
+        <w:t>Fall in interest cover: correct.</w:t>
       </w:r>
       <w:r>
         <w:rPr/>
-        <w:t xml:space="preserve"> Intermediaries do not guarantee returns to borrowers.</w:t>
+        <w:t xml:space="preserve"> Profits cover the interest charge fewer times, so there is less margin of safety if profits fall.</w:t>
       </w:r>
     </w:p>
     <w:p>
@@ -6115,11 +6612,43 @@
         <w:rPr>
           <w:b/>
         </w:rPr>
-        <w:t>Removing the need to publish accounts: wrong.</w:t>
+        <w:t>Rise in gearing: correct.</w:t>
       </w:r>
       <w:r>
         <w:rPr/>
-        <w:t xml:space="preserve"> Publication of financial statements is a legal and regulatory requirement, which intermediaries do not affect.</w:t>
+        <w:t xml:space="preserve"> More debt relative to equity increases the fixed interest burden that ranks ahead of shareholders.</w:t>
+      </w:r>
+    </w:p>
+    <w:p>
+      <w:pPr>
+        <w:pStyle w:val="ListBullet"/>
+        <w:spacing w:after="40"/>
+      </w:pPr>
+      <w:r>
+        <w:rPr>
+          <w:b/>
+        </w:rPr>
+        <w:t>Rise in dividend yield: wrong.</w:t>
+      </w:r>
+      <w:r>
+        <w:rPr/>
+        <w:t xml:space="preserve"> This is a market return measure. It can rise simply because the share price falls or the dividend increases.</w:t>
+      </w:r>
+    </w:p>
+    <w:p>
+      <w:pPr>
+        <w:pStyle w:val="ListBullet"/>
+        <w:spacing w:after="40"/>
+      </w:pPr>
+      <w:r>
+        <w:rPr>
+          <w:b/>
+        </w:rPr>
+        <w:t>Rise in P/E ratio: wrong.</w:t>
+      </w:r>
+      <w:r>
+        <w:rPr/>
+        <w:t xml:space="preserve"> A higher P/E usually reflects market confidence in future earnings growth, not higher financial risk.</w:t>
       </w:r>
     </w:p>
     <w:p>

</xml_diff>